<commit_message>
repo: add .gitattributes, normalize line endings to LF
</commit_message>
<xml_diff>
--- a/Protocolo_descarga_PRECIPITACION.docx
+++ b/Protocolo_descarga_PRECIPITACION.docx
@@ -537,34 +537,62 @@
         <w:rPr>
           <w:color w:val="1F3864"/>
         </w:rPr>
-        <w:t xml:space="preserve">4. Work split (TWILL / Omar)</w:t>
-      </w:r>
-    </w:p>
-    <w:p>
-      <w:pPr>
-        <w:spacing w:after="120"/>
-      </w:pPr>
-      <w:r>
-        <w:t xml:space="preserve">Split by the two river systems so neither person’s area overlaps. Counts are </w:t>
-      </w:r>
-      <w:r>
-        <w:rPr>
-          <w:b/>
-          <w:bCs/>
-        </w:rPr>
-        <w:t xml:space="preserve">all-category active stations</w:t>
-      </w:r>
-      <w:r>
-        <w:t xml:space="preserve"> — the precise precipitation-only list is in </w:t>
+        <w:t xml:space="preserve">4. Work split (TWILL / Omar) — driven by the viability check</w:t>
+      </w:r>
+    </w:p>
+    <w:p>
+      <w:pPr>
+        <w:spacing w:after="120"/>
+      </w:pPr>
+      <w:r>
+        <w:t xml:space="preserve">The automatic first-pass (from the download script) was assessed and </w:t>
+      </w:r>
+      <w:r>
+        <w:rPr>
+          <w:b/>
+          <w:bCs/>
+        </w:rPr>
+        <w:t xml:space="preserve">only covers the Magdalena main stem</w:t>
+      </w:r>
+      <w:r>
+        <w:t xml:space="preserve"> — it passes the ENSO wet/dry test there, but has </w:t>
+      </w:r>
+      <w:r>
+        <w:rPr>
+          <w:b/>
+          <w:bCs/>
+        </w:rPr>
+        <w:t xml:space="preserve">almost no stations in the Cauca system or the lowlands</w:t>
+      </w:r>
+      <w:r>
+        <w:t xml:space="preserve">. So DHIME is prioritised exactly where automatic is empty. The curated target list is </w:t>
       </w:r>
       <w:r>
         <w:rPr>
           <w:rFonts w:ascii="Consolas" w:cs="Consolas" w:eastAsia="Consolas" w:hAnsi="Consolas"/>
         </w:rPr>
-        <w:t xml:space="preserve">stations_precip_catalog.csv</w:t>
-      </w:r>
-      <w:r>
-        <w:t xml:space="preserve"> (produced by the download script). Rebalance if needed, e.g. move Medio Magdalena to TWILL.</w:t>
+        <w:t xml:space="preserve">data/raw/observed/precip/dhime_target_stations.csv</w:t>
+      </w:r>
+      <w:r>
+        <w:t xml:space="preserve"> — 684 stations, ≤2 per 0.25° cell, all installed before 2011, ranked by category and status (columns </w:t>
+      </w:r>
+      <w:r>
+        <w:rPr>
+          <w:rFonts w:ascii="Consolas" w:cs="Consolas" w:eastAsia="Consolas" w:hAnsi="Consolas"/>
+        </w:rPr>
+        <w:t xml:space="preserve">priority</w:t>
+      </w:r>
+      <w:r>
+        <w:t xml:space="preserve"> and </w:t>
+      </w:r>
+      <w:r>
+        <w:rPr>
+          <w:rFonts w:ascii="Consolas" w:cs="Consolas" w:eastAsia="Consolas" w:hAnsi="Consolas"/>
+        </w:rPr>
+        <w:t xml:space="preserve">assigned_to</w:t>
+      </w:r>
+      <w:r>
+        <w:t xml:space="preserve">).</w:t>
       </w:r>
     </w:p>
     <w:tbl>
@@ -580,14 +608,15 @@
         </w:tblBorders>
       </w:tblPr>
       <w:tblGrid>
-        <w:gridCol w:w="1900"/>
-        <w:gridCol w:w="5460"/>
-        <w:gridCol w:w="2000"/>
+        <w:gridCol w:w="1500"/>
+        <w:gridCol w:w="2650"/>
+        <w:gridCol w:w="3510"/>
+        <w:gridCol w:w="1700"/>
       </w:tblGrid>
       <w:tr>
         <w:tc>
           <w:tcPr>
-            <w:tcW w:type="dxa" w:w="1900"/>
+            <w:tcW w:type="dxa" w:w="1500"/>
             <w:shd w:fill="1F3864" w:color="auto" w:val="clear"/>
             <w:tcMar>
               <w:top w:type="dxa" w:w="60"/>
@@ -608,7 +637,28 @@
         </w:tc>
         <w:tc>
           <w:tcPr>
-            <w:tcW w:type="dxa" w:w="5460"/>
+            <w:tcW w:type="dxa" w:w="2650"/>
+            <w:shd w:fill="1F3864" w:color="auto" w:val="clear"/>
+            <w:tcMar>
+              <w:top w:type="dxa" w:w="60"/>
+              <w:left w:type="dxa" w:w="100"/>
+              <w:bottom w:type="dxa" w:w="60"/>
+              <w:right w:type="dxa" w:w="100"/>
+            </w:tcMar>
+          </w:tcPr>
+          <w:p>
+            <w:r>
+              <w:rPr>
+                <w:b/>
+                <w:bCs/>
+              </w:rPr>
+              <w:t xml:space="preserve">Priority</w:t>
+            </w:r>
+          </w:p>
+        </w:tc>
+        <w:tc>
+          <w:tcPr>
+            <w:tcW w:type="dxa" w:w="3510"/>
             <w:shd w:fill="1F3864" w:color="auto" w:val="clear"/>
             <w:tcMar>
               <w:top w:type="dxa" w:w="60"/>
@@ -629,7 +679,7 @@
         </w:tc>
         <w:tc>
           <w:tcPr>
-            <w:tcW w:type="dxa" w:w="2000"/>
+            <w:tcW w:type="dxa" w:w="1700"/>
             <w:shd w:fill="1F3864" w:color="auto" w:val="clear"/>
             <w:tcMar>
               <w:top w:type="dxa" w:w="60"/>
@@ -644,7 +694,7 @@
                 <w:b/>
                 <w:bCs/>
               </w:rPr>
-              <w:t xml:space="preserve">≈ active stations</w:t>
+              <w:t xml:space="preserve">Stations</w:t>
             </w:r>
           </w:p>
         </w:tc>
@@ -652,8 +702,8 @@
       <w:tr>
         <w:tc>
           <w:tcPr>
-            <w:tcW w:type="dxa" w:w="1900"/>
-            <w:shd w:fill="F2F2F2" w:color="auto" w:val="clear"/>
+            <w:tcW w:type="dxa" w:w="1500"/>
+            <w:shd w:fill="FCE4D6" w:color="auto" w:val="clear"/>
             <w:tcMar>
               <w:top w:type="dxa" w:w="60"/>
               <w:left w:type="dxa" w:w="100"/>
@@ -669,35 +719,52 @@
         </w:tc>
         <w:tc>
           <w:tcPr>
-            <w:tcW w:type="dxa" w:w="5460"/>
-            <w:shd w:fill="F2F2F2" w:color="auto" w:val="clear"/>
-            <w:tcMar>
-              <w:top w:type="dxa" w:w="60"/>
-              <w:left w:type="dxa" w:w="100"/>
-              <w:bottom w:type="dxa" w:w="60"/>
-              <w:right w:type="dxa" w:w="100"/>
-            </w:tcMar>
-          </w:tcPr>
-          <w:p>
-            <w:r>
-              <w:t xml:space="preserve">Cauca · Nechí · Bajo Magdalena-Cauca-San Jorge  (the Cauca-river system, west)</w:t>
-            </w:r>
-          </w:p>
-        </w:tc>
-        <w:tc>
-          <w:tcPr>
-            <w:tcW w:type="dxa" w:w="2000"/>
-            <w:shd w:fill="F2F2F2" w:color="auto" w:val="clear"/>
-            <w:tcMar>
-              <w:top w:type="dxa" w:w="60"/>
-              <w:left w:type="dxa" w:w="100"/>
-              <w:bottom w:type="dxa" w:w="60"/>
-              <w:right w:type="dxa" w:w="100"/>
-            </w:tcMar>
-          </w:tcPr>
-          <w:p>
-            <w:r>
-              <w:t xml:space="preserve">~1,743</w:t>
+            <w:tcW w:type="dxa" w:w="2650"/>
+            <w:shd w:fill="FCE4D6" w:color="auto" w:val="clear"/>
+            <w:tcMar>
+              <w:top w:type="dxa" w:w="60"/>
+              <w:left w:type="dxa" w:w="100"/>
+              <w:bottom w:type="dxa" w:w="60"/>
+              <w:right w:type="dxa" w:w="100"/>
+            </w:tcMar>
+          </w:tcPr>
+          <w:p>
+            <w:r>
+              <w:t xml:space="preserve">1 — GAP (automatic empty)</w:t>
+            </w:r>
+          </w:p>
+        </w:tc>
+        <w:tc>
+          <w:tcPr>
+            <w:tcW w:type="dxa" w:w="3510"/>
+            <w:shd w:fill="FCE4D6" w:color="auto" w:val="clear"/>
+            <w:tcMar>
+              <w:top w:type="dxa" w:w="60"/>
+              <w:left w:type="dxa" w:w="100"/>
+              <w:bottom w:type="dxa" w:w="60"/>
+              <w:right w:type="dxa" w:w="100"/>
+            </w:tcMar>
+          </w:tcPr>
+          <w:p>
+            <w:r>
+              <w:t xml:space="preserve">Cauca · Nechí · Bajo Magdalena-Cauca-San Jorge</w:t>
+            </w:r>
+          </w:p>
+        </w:tc>
+        <w:tc>
+          <w:tcPr>
+            <w:tcW w:type="dxa" w:w="1700"/>
+            <w:shd w:fill="FCE4D6" w:color="auto" w:val="clear"/>
+            <w:tcMar>
+              <w:top w:type="dxa" w:w="60"/>
+              <w:left w:type="dxa" w:w="100"/>
+              <w:bottom w:type="dxa" w:w="60"/>
+              <w:right w:type="dxa" w:w="100"/>
+            </w:tcMar>
+          </w:tcPr>
+          <w:p>
+            <w:r>
+              <w:t xml:space="preserve">217</w:t>
             </w:r>
           </w:p>
         </w:tc>
@@ -705,7 +772,8 @@
       <w:tr>
         <w:tc>
           <w:tcPr>
-            <w:tcW w:type="dxa" w:w="1900"/>
+            <w:tcW w:type="dxa" w:w="1500"/>
+            <w:shd w:fill="FCE4D6" w:color="auto" w:val="clear"/>
             <w:tcMar>
               <w:top w:type="dxa" w:w="60"/>
               <w:left w:type="dxa" w:w="100"/>
@@ -721,33 +789,122 @@
         </w:tc>
         <w:tc>
           <w:tcPr>
-            <w:tcW w:type="dxa" w:w="5460"/>
-            <w:tcMar>
-              <w:top w:type="dxa" w:w="60"/>
-              <w:left w:type="dxa" w:w="100"/>
-              <w:bottom w:type="dxa" w:w="60"/>
-              <w:right w:type="dxa" w:w="100"/>
-            </w:tcMar>
-          </w:tcPr>
-          <w:p>
-            <w:r>
-              <w:t xml:space="preserve">Alto Magdalena · Medio Magdalena · Sogamoso · Saldaña · Cesar · Bajo Magdalena  (the Magdalena main stem, east)</w:t>
-            </w:r>
-          </w:p>
-        </w:tc>
-        <w:tc>
-          <w:tcPr>
-            <w:tcW w:type="dxa" w:w="2000"/>
-            <w:tcMar>
-              <w:top w:type="dxa" w:w="60"/>
-              <w:left w:type="dxa" w:w="100"/>
-              <w:bottom w:type="dxa" w:w="60"/>
-              <w:right w:type="dxa" w:w="100"/>
-            </w:tcMar>
-          </w:tcPr>
-          <w:p>
-            <w:r>
-              <w:t xml:space="preserve">~2,355</w:t>
+            <w:tcW w:type="dxa" w:w="2650"/>
+            <w:shd w:fill="FCE4D6" w:color="auto" w:val="clear"/>
+            <w:tcMar>
+              <w:top w:type="dxa" w:w="60"/>
+              <w:left w:type="dxa" w:w="100"/>
+              <w:bottom w:type="dxa" w:w="60"/>
+              <w:right w:type="dxa" w:w="100"/>
+            </w:tcMar>
+          </w:tcPr>
+          <w:p>
+            <w:r>
+              <w:t xml:space="preserve">1 — GAP (automatic empty)</w:t>
+            </w:r>
+          </w:p>
+        </w:tc>
+        <w:tc>
+          <w:tcPr>
+            <w:tcW w:type="dxa" w:w="3510"/>
+            <w:shd w:fill="FCE4D6" w:color="auto" w:val="clear"/>
+            <w:tcMar>
+              <w:top w:type="dxa" w:w="60"/>
+              <w:left w:type="dxa" w:w="100"/>
+              <w:bottom w:type="dxa" w:w="60"/>
+              <w:right w:type="dxa" w:w="100"/>
+            </w:tcMar>
+          </w:tcPr>
+          <w:p>
+            <w:r>
+              <w:t xml:space="preserve">Cesar · Bajo Magdalena</w:t>
+            </w:r>
+          </w:p>
+        </w:tc>
+        <w:tc>
+          <w:tcPr>
+            <w:tcW w:type="dxa" w:w="1700"/>
+            <w:shd w:fill="FCE4D6" w:color="auto" w:val="clear"/>
+            <w:tcMar>
+              <w:top w:type="dxa" w:w="60"/>
+              <w:left w:type="dxa" w:w="100"/>
+              <w:bottom w:type="dxa" w:w="60"/>
+              <w:right w:type="dxa" w:w="100"/>
+            </w:tcMar>
+          </w:tcPr>
+          <w:p>
+            <w:r>
+              <w:t xml:space="preserve">128</w:t>
+            </w:r>
+          </w:p>
+        </w:tc>
+      </w:tr>
+      <w:tr>
+        <w:tc>
+          <w:tcPr>
+            <w:tcW w:type="dxa" w:w="1500"/>
+            <w:shd w:fill="F2F2F2" w:color="auto" w:val="clear"/>
+            <w:tcMar>
+              <w:top w:type="dxa" w:w="60"/>
+              <w:left w:type="dxa" w:w="100"/>
+              <w:bottom w:type="dxa" w:w="60"/>
+              <w:right w:type="dxa" w:w="100"/>
+            </w:tcMar>
+          </w:tcPr>
+          <w:p>
+            <w:r>
+              <w:t xml:space="preserve">Omar</w:t>
+            </w:r>
+          </w:p>
+        </w:tc>
+        <w:tc>
+          <w:tcPr>
+            <w:tcW w:type="dxa" w:w="2650"/>
+            <w:shd w:fill="F2F2F2" w:color="auto" w:val="clear"/>
+            <w:tcMar>
+              <w:top w:type="dxa" w:w="60"/>
+              <w:left w:type="dxa" w:w="100"/>
+              <w:bottom w:type="dxa" w:w="60"/>
+              <w:right w:type="dxa" w:w="100"/>
+            </w:tcMar>
+          </w:tcPr>
+          <w:p>
+            <w:r>
+              <w:t xml:space="preserve">2 — has automatic backup</w:t>
+            </w:r>
+          </w:p>
+        </w:tc>
+        <w:tc>
+          <w:tcPr>
+            <w:tcW w:type="dxa" w:w="3510"/>
+            <w:shd w:fill="F2F2F2" w:color="auto" w:val="clear"/>
+            <w:tcMar>
+              <w:top w:type="dxa" w:w="60"/>
+              <w:left w:type="dxa" w:w="100"/>
+              <w:bottom w:type="dxa" w:w="60"/>
+              <w:right w:type="dxa" w:w="100"/>
+            </w:tcMar>
+          </w:tcPr>
+          <w:p>
+            <w:r>
+              <w:t xml:space="preserve">Alto Magdalena · Medio Magdalena · Sogamoso · Saldaña</w:t>
+            </w:r>
+          </w:p>
+        </w:tc>
+        <w:tc>
+          <w:tcPr>
+            <w:tcW w:type="dxa" w:w="1700"/>
+            <w:shd w:fill="F2F2F2" w:color="auto" w:val="clear"/>
+            <w:tcMar>
+              <w:top w:type="dxa" w:w="60"/>
+              <w:left w:type="dxa" w:w="100"/>
+              <w:bottom w:type="dxa" w:w="60"/>
+              <w:right w:type="dxa" w:w="100"/>
+            </w:tcMar>
+          </w:tcPr>
+          <w:p>
+            <w:r>
+              <w:t xml:space="preserve">339</w:t>
             </w:r>
           </w:p>
         </w:tc>
@@ -755,6 +912,24 @@
     </w:tbl>
     <w:p>
       <w:pPr>
+        <w:spacing w:before="120"/>
+      </w:pPr>
+      <w:r>
+        <w:rPr>
+          <w:b/>
+          <w:bCs/>
+        </w:rPr>
+        <w:t xml:space="preserve">Do Priority 1 first.</w:t>
+      </w:r>
+      <w:r>
+        <w:t xml:space="preserve"> TWILL’s 217 Cauca-side stations are the urgent gap; Omar’s 128 lowland stations next; </w:t>
+      </w:r>
+      <w:r>
+        <w:t xml:space="preserve">the 339 Priority-2 stem stations have automatic backup, so they are last (or optional if automatic proves enough there).</w:t>
+      </w:r>
+    </w:p>
+    <w:p>
+      <w:pPr>
         <w:pStyle w:val="Heading1"/>
         <w:spacing w:after="110" w:before="220"/>
       </w:pPr>
@@ -770,7 +945,7 @@
         <w:spacing w:after="120"/>
       </w:pPr>
       <w:r>
-        <w:t xml:space="preserve">Thousands of stations is more than we need. Target ~150–250 well-distributed stations that: </w:t>
+        <w:t xml:space="preserve">The target list is already curated (pre-2011, spatially even, best category/status per cell). Within it, favour stations that: </w:t>
       </w:r>
     </w:p>
     <w:p>
@@ -795,7 +970,7 @@
         <w:t xml:space="preserve">both</w:t>
       </w:r>
       <w:r>
-        <w:t xml:space="preserve"> 2011 and 2015–16;</w:t>
+        <w:t xml:space="preserve"> 2011 and 2015–16 (check in DHIME before committing);</w:t>
       </w:r>
     </w:p>
     <w:p>
@@ -810,7 +985,7 @@
         <w:t xml:space="preserve">• </w:t>
       </w:r>
       <w:r>
-        <w:t xml:space="preserve">were installed before 2011 (check fecha_instalacion in the inventory CSV);</w:t>
+        <w:t xml:space="preserve">are still “Activa” (most likely to span both study years continuously);</w:t>
       </w:r>
     </w:p>
     <w:p>
@@ -825,7 +1000,7 @@
         <w:t xml:space="preserve">• </w:t>
       </w:r>
       <w:r>
-        <w:t xml:space="preserve">are spread across elevation and sub-zones (headwaters + valleys + lowlands), not clustered in cities.</w:t>
+        <w:t xml:space="preserve">keep the spatial spread — don’t drop a whole cell, even a mediocre gauge beats an empty gap.</w:t>
       </w:r>
     </w:p>
     <w:p>

</xml_diff>